<commit_message>
Correct DIB report figures and subsidiaries against Pillar 3 Q4 2025
- FY2024 balance-sheet line items aligned to audited Pillar 3 figures
  (Sukuk 82,161; financing 212,427; cash/other 50,099; deposits 248,546;
  other liabilities 43,288) and related YoY% updated
- FY2025 NSFR corrected 109% -> 108.8% (per KM1/LIQ2)
- Subsidiaries corrected: list Noor Bank and Tamweel as consolidated
  subsidiaries; reclassify Panin (Indonesia), Bosna Bank (Bosnia) and
  T.O.M. (Turkiye) as associate/minority interests; remove Bank of
  Khartoum from the subsidiary listing
- Updated FY2024 sourcing note

Co-Authored-By: Claude Opus 4.8 <noreply@anthropic.com>
Claude-Session: https://claude.ai/code/session_01Q8JpJqbPuHRw1C1Ps5MASu
</commit_message>
<xml_diff>
--- a/DIB Credit Rating and Credit Limit Application Report.docx
+++ b/DIB Credit Rating and Credit Limit Application Report.docx
@@ -657,7 +657,7 @@
         <w:spacing w:after="120" w:line="264" w:lineRule="auto"/>
       </w:pPr>
       <w:r>
-        <w:t>DIB offers a full range of Shari’ah-compliant retail, business, corporate, treasury and investment-banking products under the guidance of its Internal Shari’ah Supervision Committee and the Higher Shari’ah Authority of the CBUAE. The Bank operates an international footprint spanning Pakistan (Dubai Islamic Bank Pakistan), Indonesia (Panin Dubai Syariah Bank), Sudan (Bank of Khartoum), Kenya (DIB Bank Kenya), Bosnia (Bosna Bank International) and Türkiye (25% in the T.O.M. digital-banking group). The four pr</w:t>
+        <w:t>DIB offers a full range of Shari’ah-compliant retail, business, corporate, treasury and investment-banking products under the guidance of its Internal Shari’ah Supervision Committee and the Higher Shari’ah Authority of the CBUAE. Its principal consolidated subsidiaries include Dubai Islamic Bank Pakistan (banking), Noor Bank PJSC and Tamweel PSC (UAE), DIB Bank Kenya, Deyaar Development (real estate) and Dar Al Sharia (Shari’ah advisory); it also holds associate and minority interests in markets including Indonesia (Panin Dubai Syariah Bank), Bosnia (Bosna Bank International) and Türkiye (the T.O.M. digital-banking group). The four pr</w:t>
       </w:r>
       <w:r>
         <w:t>incipal business lines are summarised below.</w:t>
@@ -773,7 +773,7 @@
         <w:spacing w:after="90" w:line="264" w:lineRule="auto"/>
       </w:pPr>
       <w:r>
-        <w:t>DIB leads Islamic capital-markets origination (sovereign and corporate Sukuk across Pakistan, Egypt, Türkiye and the GCC) and holds subsidiaries including DIB Pakistan, Bank of Khartoum, DIB Bank Kenya, Deyaar Development (real estate) and Dar Al Sharia (Shari’ah advisory).</w:t>
+        <w:t>DIB leads Islamic capital-markets origination (sovereign and corporate Sukuk across Pakistan, Egypt, Türkiye and the GCC) and holds subsidiaries including DIB Pakistan, Noor Bank, Tamweel, DIB Bank Kenya, Deyaar Development (real estate) and Dar Al Sharia (Shari’ah advisory).</w:t>
       </w:r>
     </w:p>
     <w:p>
@@ -2421,7 +2421,7 @@
                 <w:sz w:val="19"/>
                 <w:szCs w:val="19"/>
               </w:rPr>
-              <w:t>212,000</w:t>
+              <w:t>212,427</w:t>
             </w:r>
           </w:p>
         </w:tc>
@@ -2483,7 +2483,7 @@
                 <w:sz w:val="19"/>
                 <w:szCs w:val="19"/>
               </w:rPr>
-              <w:t>+23.6%</w:t>
+              <w:t>+23.4%</w:t>
             </w:r>
           </w:p>
         </w:tc>
@@ -2586,7 +2586,7 @@
                 <w:sz w:val="19"/>
                 <w:szCs w:val="19"/>
               </w:rPr>
-              <w:t>82,600</w:t>
+              <w:t>82,161</w:t>
             </w:r>
           </w:p>
         </w:tc>
@@ -2650,7 +2650,7 @@
                 <w:sz w:val="19"/>
                 <w:szCs w:val="19"/>
               </w:rPr>
-              <w:t>+9.7%</w:t>
+              <w:t>+10.3%</w:t>
             </w:r>
           </w:p>
         </w:tc>
@@ -2750,7 +2750,7 @@
                 <w:sz w:val="19"/>
                 <w:szCs w:val="19"/>
               </w:rPr>
-              <w:t>50,087</w:t>
+              <w:t>50,099</w:t>
             </w:r>
           </w:p>
         </w:tc>
@@ -3209,7 +3209,7 @@
                 <w:sz w:val="19"/>
                 <w:szCs w:val="19"/>
               </w:rPr>
-              <w:t>248,510</w:t>
+              <w:t>248,546</w:t>
             </w:r>
           </w:p>
         </w:tc>
@@ -3373,7 +3373,7 @@
                 <w:sz w:val="19"/>
                 <w:szCs w:val="19"/>
               </w:rPr>
-              <w:t>43,324</w:t>
+              <w:t>43,288</w:t>
             </w:r>
           </w:p>
         </w:tc>
@@ -3435,15 +3435,14 @@
                 <w:sz w:val="19"/>
                 <w:szCs w:val="19"/>
               </w:rPr>
-              <w:t>−</w:t>
-            </w:r>
-            <w:r>
-              <w:rPr>
-                <w:color w:val="222222"/>
-                <w:sz w:val="19"/>
-                <w:szCs w:val="19"/>
-              </w:rPr>
-              <w:t>1.6%</w:t>
+              <w:t>−1.5%</w:t>
+            </w:r>
+            <w:r>
+              <w:rPr>
+                <w:color w:val="222222"/>
+                <w:sz w:val="19"/>
+                <w:szCs w:val="19"/>
+              </w:rPr>
             </w:r>
           </w:p>
         </w:tc>
@@ -5437,7 +5436,7 @@
           <w:sz w:val="17"/>
           <w:szCs w:val="17"/>
         </w:rPr>
-        <w:t>FY2023 and FY2025 reflect audited line items in full (FY2025 per the audited 31-Dec-2025 comparative in the Q1 2026 interim statements); all equity components and balance-sheet totals are audited for all three years. For FY2024, total assets (AED 344,687m, per published statements) and equity are audited; customers’ deposits are derived and the remaining asset/liability items are grouped to reconcile to the audited totals. YoY% is FY2025 vs FY2024.</w:t>
+        <w:t>FY2023 and FY2025 reflect audited line items in full (FY2025 per the audited 31-Dec-2025 comparative in the Q1 2026 interim statements); all equity components and balance-sheet totals are audited for all three years. FY2024 line items are sourced from the Bank’s audited published financial statements (as set out in its Pillar 3 disclosures), with asset and liability sub-items grouped to reconcile to the audited totals. YoY% is FY2025 vs FY2024.</w:t>
       </w:r>
     </w:p>
     <w:p>
@@ -10930,7 +10929,7 @@
         <w:spacing w:after="90" w:line="264" w:lineRule="auto"/>
       </w:pPr>
       <w:r>
-        <w:t>Capital and liquidity remained sound: CET1 12.3%, Tier 1 14.8%, CAR 15.5%, LCR 157%, NSFR 109%. A proposed dividend of 35 fils/share was approved (AED 2.53 billion).</w:t>
+        <w:t>Capital and liquidity remained sound: CET1 12.3%, Tier 1 14.8%, CAR 15.5%, LCR 157%, NSFR 108.8%. A proposed dividend of 35 fils/share was approved (AED 2.53 billion).</w:t>
       </w:r>
     </w:p>
     <w:p>
@@ -12845,7 +12844,7 @@
           <w:sz w:val="17"/>
           <w:szCs w:val="17"/>
         </w:rPr>
-        <w:t>FY2023–FY2025 are audited full years; Q1 2026 is an unaudited 3-month interim (profit figures are quarterly, not annualised). NSFR was 109% at FY2025 and 106% at Q1 2026 (minimum 100%); post-tax RoTE was 20% / 22% / 18% across FY2023–FY2025 and pre-tax RoTE was 21% in Q1 2026.</w:t>
+        <w:t>FY2023–FY2025 are audited full years; Q1 2026 is an unaudited 3-month interim (profit figures are quarterly, not annualised). NSFR was 108.8% at FY2025 and 106% at Q1 2026 (minimum 100%); post-tax RoTE was 20% / 22% / 18% across FY2023–FY2025 and pre-tax RoTE was 21% in Q1 2026.</w:t>
       </w:r>
     </w:p>
     <w:p>
@@ -15107,7 +15106,7 @@
         <w:t>Liquidity risk is managed under CBUAE requirements and ALCO oversight. DIB relies primarily on a granular, relationship-based retail and corporate deposit franchise, supplemented opportunistically by Sukuk issuance (typically &gt;3-year tenor) and short-term interbank funding. A portfolio of high-quality liquid assets — central-bank balances, CBUAE certificates and high-grade Sukuk — backs the liquidity position. As a larger Basel III bank, DIB monitors the Liquidity Coverage Ratio (LCR) and Net Stable Funding</w:t>
       </w:r>
       <w:r>
-        <w:t xml:space="preserve"> Ratio (NSFR) rather than ELAR/ASRR; the LCR (157% at FY2025, 121% at Q1 2026) and NSFR (109% at FY2025, 106% at Q1 2026) comfortably exceed the 100% regulatory minima.</w:t>
+        <w:t xml:space="preserve"> Ratio (NSFR) rather than ELAR/ASRR; the LCR (157% at FY2025, 121% at Q1 2026) and NSFR (108.8% at FY2025, 106% at Q1 2026) comfortably exceed the 100% regulatory minima.</w:t>
       </w:r>
     </w:p>
     <w:tbl>
@@ -15487,7 +15486,7 @@
           <w:sz w:val="17"/>
           <w:szCs w:val="17"/>
         </w:rPr>
-        <w:t>Source: DIB CBUAE-regulated liquidity disclosures. CBUAE minimum: LCR ≥ 100%. The Net Stable Funding Ratio (NSFR) was 109% at FY2025 and 106% at Q1 2026, above the 100% minimum. As a larger Basel III bank, DIB monitors LCR/NSFR rather than the ELAR/ASRR ratios used by smaller UAE banks. The lower Q1 2026 LCR (still well above the minimum) reflects strong financing deployment and normal quarter-end positioning.</w:t>
+        <w:t>Source: DIB CBUAE-regulated liquidity disclosures. CBUAE minimum: LCR ≥ 100%. The Net Stable Funding Ratio (NSFR) was 108.8% at FY2025 and 106% at Q1 2026, above the 100% minimum. As a larger Basel III bank, DIB monitors LCR/NSFR rather than the ELAR/ASRR ratios used by smaller UAE banks. The lower Q1 2026 LCR (still well above the minimum) reflects strong financing deployment and normal quarter-end positioning.</w:t>
       </w:r>
     </w:p>
     <w:p>

</xml_diff>